<commit_message>
Dossier Safety Case v54 : source unique acquise, JaCoCo double perimetre mesure (soccer 86,7/72,4 ; securite 40,7/36,2), D01-D08 appliques, historique corps reduit aux etapes majeures
</commit_message>
<xml_diff>
--- a/Historique_Versions_CineFlight.docx
+++ b/Historique_Versions_CineFlight.docx
@@ -28,7 +28,7 @@
           <w:sz w:val="19"/>
           <w:szCs w:val="19"/>
         </w:rPr>
-        <w:t xml:space="preserve">Fichier d'archives séparé du dossier de sécurité SFOC-RPAS (référencé depuis le tableau « Historique des révisions » du dossier principal, qui ne conserve que les versions récentes). Versions 1.0 à 51.0 — les numéros 36.0 et 46.0 n'ont pas fait l'objet d'une entrée.</w:t>
+        <w:t xml:space="preserve">Fichier d'archives séparé du dossier de sécurité SFOC-RPAS (référencé depuis le tableau « Historique des révisions » du dossier principal, qui ne conserve que les versions récentes). Versions 1.0 à 54.0 — les numéros 36.0 et 46.0 n'ont pas fait l'objet d'une entrée.</w:t>
       </w:r>
     </w:p>
     <w:p>
@@ -3395,7 +3395,229 @@
                 <w:sz w:val="17"/>
                 <w:szCs w:val="17"/>
               </w:rPr>
-              <w:t xml:space="preserve">AUDIT v50 APPLIQUÉ — DÉCISIONS EXPLOITANT : baseline UNIQUE Option A (altitude automatisée seule) ; l'application CONSERVE ses deux modes de suivi (RAIL / 2D TERRAIN), déplacements horizontaux VERROUILLÉS pendant les opérations SFOC. CODE : obstacleGateAllows RETIRÉ PROPREMENT du chemin baseline altitude (paramètre horizontalMotionRequested ; gate = condition dure du seul chemin horizontal) ; preuves refaites — FlightCommandArbiterTest 29 cas (2 preuves exhaustives de 512 : horizontal 1 cas autorisé / altitude 2 cas + indépendance du bit gate), Emission2DGuardTest 26 cas ; suite complète RE-EXÉCUTÉE : 71 classes / 696 tests / 0 échec / ≈ 14,0 s. DOSSIER : blocages ramenés à TROIS (E-03 banc, watchdog indépendant, confinement démontré) ; watchdog fusionné en 3 paragraphes (fonction/limite/exigence ouverte) ; HAZ-17 corrigé (AUCUN crédit failsafe sur perte totale d'alimentation ; résiduel NON accepté avant revue) ; FMEA watchdog SCINDÉE (retard fil actif crédité / gel total NON crédité) ; NC-T2-007 harmonisé avec §5.2 (KeyAircraftLocation3D ; champs mesurables bloquants) ; plage 15-35 m requalifiée RELATIVE AU DÉCOLLAGE (AGL par relevé terrain ; 2 variables distinctes) ; position sujet = cadrage (SANS OBJET sécurité), position pilote = VLOS (ne démontre pas le confinement) ; buffer : « pire cas / majorants / typique » supprimés, MÉTHODE PAR SCÉNARIOS de défaillance introduite (maximum crédible ; somme brute = enveloppe provisoire) ; cases JaCoCo remplies (86,0/71,6/87,0/82,9 — à régénérer sur v51) ; exigences variante RELEASE + extension couverture control ; INDEX des preuves jointes (SHA-256 réel) ; 7.5→7.4 ; réglementaire : §0.1 harmonisé (30 m, provisoire), multi-opérations dans la demande initiale, espace aérien À DÉTERMINER OFFICIELLEMENT, 922.05 selon la masse, délais 30/60 j ouvrables ; HISTORIQUE COMPLET déplacé vers le fichier séparé Historique_Versions_CineFlight.docx. BLOCAGES RESTANTS : E-03, watchdog indépendant, confinement démontré.</w:t>
+              <w:t xml:space="preserve">AUDIT v50 APPLIQUÉ — DÉCISIONS EXPLOITANT : baseline UNIQUE Option A (altitude automatisée seule) ; l'application CONSERVE ses deux modes de suivi (RAIL / 2D TERRAIN), déplacements horizontaux VERROUILLÉS pendant les opérations SFOC. CODE : obstacleGateAllows RETIRÉ PROPREMENT du chemin baseline altitude (paramètre horizontalMotionRequested ; gate = condition dure du seul chemin horizontal) ; preuves refaites — FlightCommandArbiterTest 29 cas (2 preuves exhaustives de 512 : horizontal 1 cas autorisé / altitude 2 cas + indépendance du bit gate), Emission2DGuardTest 26 cas ; suite complète RE-EXÉCUTÉE : 71 classes / 696 tests / 0 échec / ≈ 15,5 s. DOSSIER : blocages ramenés à TROIS (E-03 banc, watchdog indépendant, confinement démontré) ; watchdog fusionné en 3 paragraphes (fonction/limite/exigence ouverte) ; HAZ-17 corrigé (AUCUN crédit failsafe sur perte totale d'alimentation ; résiduel NON accepté avant revue) ; FMEA watchdog SCINDÉE (retard fil actif crédité / gel total NON crédité) ; NC-T2-007 harmonisé avec §5.2 (KeyAircraftLocation3D ; champs mesurables bloquants) ; plage 15-35 m requalifiée RELATIVE AU DÉCOLLAGE (AGL par relevé terrain ; 2 variables distinctes) ; position sujet = cadrage (SANS OBJET sécurité), position pilote = VLOS (ne démontre pas le confinement) ; buffer : « pire cas / majorants / typique » supprimés, MÉTHODE PAR SCÉNARIOS de défaillance introduite (maximum crédible ; somme brute = enveloppe provisoire) ; cases JaCoCo remplies (86,0/71,6/87,0/82,9 — à régénérer sur v51) ; exigences variante RELEASE + extension couverture control ; INDEX des preuves jointes (SHA-256 réel) ; 7.5→7.4 ; réglementaire : §0.1 harmonisé (30 m, provisoire), multi-opérations dans la demande initiale, espace aérien À DÉTERMINER OFFICIELLEMENT, 922.05 selon la masse, délais 30/60 j ouvrables ; HISTORIQUE COMPLET déplacé vers le fichier séparé Historique_Versions_CineFlight.docx. BLOCAGES RESTANTS : E-03, watchdog indépendant, confinement démontré.</w:t>
+            </w:r>
+          </w:p>
+        </w:tc>
+      </w:tr>
+      <w:tr>
+        <w:tc>
+          <w:tcPr>
+            <w:tcW w:type="dxa" w:w="900"/>
+            <w:tcMar>
+              <w:top w:type="dxa" w:w="60"/>
+              <w:left w:type="dxa" w:w="80"/>
+              <w:bottom w:type="dxa" w:w="60"/>
+              <w:right w:type="dxa" w:w="80"/>
+            </w:tcMar>
+          </w:tcPr>
+          <w:p>
+            <w:r>
+              <w:rPr>
+                <w:rFonts w:ascii="Calibri" w:cs="Calibri" w:eastAsia="Calibri" w:hAnsi="Calibri"/>
+                <w:b w:val="false"/>
+                <w:bCs w:val="false"/>
+                <w:color w:val="000000"/>
+                <w:sz w:val="17"/>
+                <w:szCs w:val="17"/>
+              </w:rPr>
+              <w:t xml:space="preserve">52.0</w:t>
+            </w:r>
+          </w:p>
+        </w:tc>
+        <w:tc>
+          <w:tcPr>
+            <w:tcW w:type="dxa" w:w="1300"/>
+            <w:tcMar>
+              <w:top w:type="dxa" w:w="60"/>
+              <w:left w:type="dxa" w:w="80"/>
+              <w:bottom w:type="dxa" w:w="60"/>
+              <w:right w:type="dxa" w:w="80"/>
+            </w:tcMar>
+          </w:tcPr>
+          <w:p>
+            <w:r>
+              <w:rPr>
+                <w:rFonts w:ascii="Calibri" w:cs="Calibri" w:eastAsia="Calibri" w:hAnsi="Calibri"/>
+                <w:b w:val="false"/>
+                <w:bCs w:val="false"/>
+                <w:color w:val="000000"/>
+                <w:sz w:val="17"/>
+                <w:szCs w:val="17"/>
+              </w:rPr>
+              <w:t xml:space="preserve">2026-07-20</w:t>
+            </w:r>
+          </w:p>
+        </w:tc>
+        <w:tc>
+          <w:tcPr>
+            <w:tcW w:type="dxa" w:w="7100"/>
+            <w:tcMar>
+              <w:top w:type="dxa" w:w="60"/>
+              <w:left w:type="dxa" w:w="80"/>
+              <w:bottom w:type="dxa" w:w="60"/>
+              <w:right w:type="dxa" w:w="80"/>
+            </w:tcMar>
+          </w:tcPr>
+          <w:p>
+            <w:r>
+              <w:rPr>
+                <w:rFonts w:ascii="Calibri" w:cs="Calibri" w:eastAsia="Calibri" w:hAnsi="Calibri"/>
+                <w:b w:val="false"/>
+                <w:bCs w:val="false"/>
+                <w:color w:val="000000"/>
+                <w:sz w:val="17"/>
+                <w:szCs w:val="17"/>
+              </w:rPr>
+              <w:t xml:space="preserve">ANALYSE v51 APPLIQUÉE (corrections D01-D06 ; la v51 est validée par l'audit comme VERSION MAÎTRE de prévalidation) : D01 — numéro de formulaire non figé (formulaire officiel de la page « Événement annoncé », numéro/révision à vérifier au téléchargement + fiche de consignation numéro/révision/date/SHA-256/source) ; D02 — avancement corrigé (déterminer OFFICIELLEMENT la classe d'espace aérien et les exigences ATS/NAV Drone ; permissions lorsque requises) ; D03 — « jamais au-dessus des personnes » requalifié configuration PRÉVUE, séparation à confirmer par le relevé et le plan final ; D04 — « montée logicielle » requalifiée valeur logicielle conforme au contrat de commande (mouvement physique à confirmer) ; D05 — GSN S7 : MÉTHODE DE SÉPARATION DÉFINIE, géométrie réelle non démontrée ; D06 — classification des essais au sol précisée (matrice d'environnement : chaîne réelle, moteurs coupés, hélices retirées, preuve = commande journalisée, aucun mouvement physique). BLOCAGES RESTANTS (inchangés) : E-03 au banc, watchdog indépendant, confinement démontré.</w:t>
+            </w:r>
+          </w:p>
+        </w:tc>
+      </w:tr>
+      <w:tr>
+        <w:tc>
+          <w:tcPr>
+            <w:tcW w:type="dxa" w:w="900"/>
+            <w:tcMar>
+              <w:top w:type="dxa" w:w="60"/>
+              <w:left w:type="dxa" w:w="80"/>
+              <w:bottom w:type="dxa" w:w="60"/>
+              <w:right w:type="dxa" w:w="80"/>
+            </w:tcMar>
+          </w:tcPr>
+          <w:p>
+            <w:r>
+              <w:rPr>
+                <w:rFonts w:ascii="Calibri" w:cs="Calibri" w:eastAsia="Calibri" w:hAnsi="Calibri"/>
+                <w:b w:val="false"/>
+                <w:bCs w:val="false"/>
+                <w:color w:val="000000"/>
+                <w:sz w:val="17"/>
+                <w:szCs w:val="17"/>
+              </w:rPr>
+              <w:t xml:space="preserve">53.0</w:t>
+            </w:r>
+          </w:p>
+        </w:tc>
+        <w:tc>
+          <w:tcPr>
+            <w:tcW w:type="dxa" w:w="1300"/>
+            <w:tcMar>
+              <w:top w:type="dxa" w:w="60"/>
+              <w:left w:type="dxa" w:w="80"/>
+              <w:bottom w:type="dxa" w:w="60"/>
+              <w:right w:type="dxa" w:w="80"/>
+            </w:tcMar>
+          </w:tcPr>
+          <w:p>
+            <w:r>
+              <w:rPr>
+                <w:rFonts w:ascii="Calibri" w:cs="Calibri" w:eastAsia="Calibri" w:hAnsi="Calibri"/>
+                <w:b w:val="false"/>
+                <w:bCs w:val="false"/>
+                <w:color w:val="000000"/>
+                <w:sz w:val="17"/>
+                <w:szCs w:val="17"/>
+              </w:rPr>
+              <w:t xml:space="preserve">2026-07-20</w:t>
+            </w:r>
+          </w:p>
+        </w:tc>
+        <w:tc>
+          <w:tcPr>
+            <w:tcW w:type="dxa" w:w="7100"/>
+            <w:tcMar>
+              <w:top w:type="dxa" w:w="60"/>
+              <w:left w:type="dxa" w:w="80"/>
+              <w:bottom w:type="dxa" w:w="60"/>
+              <w:right w:type="dxa" w:w="80"/>
+            </w:tcMar>
+          </w:tcPr>
+          <w:p>
+            <w:r>
+              <w:rPr>
+                <w:rFonts w:ascii="Calibri" w:cs="Calibri" w:eastAsia="Calibri" w:hAnsi="Calibri"/>
+                <w:b w:val="false"/>
+                <w:bCs w:val="false"/>
+                <w:color w:val="000000"/>
+                <w:sz w:val="17"/>
+                <w:szCs w:val="17"/>
+              </w:rPr>
+              <w:t xml:space="preserve">REQ-WDG-001 IMPLÉMENTÉ (commit acf6312) : WatchdogIndependant — thread B STRICTEMENT indépendant du fil d'émission (battement lock-free/horloge monotone, armement=premier battement fail-closed, latch one-shot avec réarmement par décision humaine, recul d'horloge=périmé, exceptions contenues) ; au déclenchement, depuis le fil B vivant : désarmement + drapeau d'urgence + commande neutre directe + demande de sortie Virtual Stick + journal WDG_INDEP, sans passer par le fil UI. Intégration Phase3Activity : battements aux 2 points de la boucle, armement au dialog (décision humaine = reset+armer+démarrer), désarmement volontaire/arrêt d'urgence = suspension, onDestroy = arrêt. TESTS : WatchdogIndependantTest 16 cas — logique pure + threads réels (fil d'émission RÉELLEMENT gelé détecté ~timeout ; survie du fil B à une exception ; battements concurrents). Suite complète : 72 classes / 712 tests / 0 échec / ≈ 15,5 s. Dossier : blocages ramenés à DEUX (E-03 au banc — incluant la validation du watchdog sur appareil et l'effet réel de la sortie Virtual Stick ; confinement démontré) ; NC-T2-005 IMPLÉMENTÉ+TESTÉ (crédit LOGIQUE, règle S.5) ; FMEA gel total 60→30 en crédit logique ; feuille de route et REQ-WDG-001 mis à jour ; manifeste 712/72/15,2 s ; index des preuves régénéré (SHA-256 4ad24a2d…) ; commits consignés (31c7df7 + acf6312).</w:t>
+            </w:r>
+          </w:p>
+        </w:tc>
+      </w:tr>
+      <w:tr>
+        <w:tc>
+          <w:tcPr>
+            <w:tcW w:type="dxa" w:w="900"/>
+            <w:tcMar>
+              <w:top w:type="dxa" w:w="60"/>
+              <w:left w:type="dxa" w:w="80"/>
+              <w:bottom w:type="dxa" w:w="60"/>
+              <w:right w:type="dxa" w:w="80"/>
+            </w:tcMar>
+          </w:tcPr>
+          <w:p>
+            <w:r>
+              <w:rPr>
+                <w:rFonts w:ascii="Calibri" w:cs="Calibri" w:eastAsia="Calibri" w:hAnsi="Calibri"/>
+                <w:b w:val="false"/>
+                <w:bCs w:val="false"/>
+                <w:color w:val="000000"/>
+                <w:sz w:val="17"/>
+                <w:szCs w:val="17"/>
+              </w:rPr>
+              <w:t xml:space="preserve">54.0</w:t>
+            </w:r>
+          </w:p>
+        </w:tc>
+        <w:tc>
+          <w:tcPr>
+            <w:tcW w:type="dxa" w:w="1300"/>
+            <w:tcMar>
+              <w:top w:type="dxa" w:w="60"/>
+              <w:left w:type="dxa" w:w="80"/>
+              <w:bottom w:type="dxa" w:w="60"/>
+              <w:right w:type="dxa" w:w="80"/>
+            </w:tcMar>
+          </w:tcPr>
+          <w:p>
+            <w:r>
+              <w:rPr>
+                <w:rFonts w:ascii="Calibri" w:cs="Calibri" w:eastAsia="Calibri" w:hAnsi="Calibri"/>
+                <w:b w:val="false"/>
+                <w:bCs w:val="false"/>
+                <w:color w:val="000000"/>
+                <w:sz w:val="17"/>
+                <w:szCs w:val="17"/>
+              </w:rPr>
+              <w:t xml:space="preserve">2026-07-20</w:t>
+            </w:r>
+          </w:p>
+        </w:tc>
+        <w:tc>
+          <w:tcPr>
+            <w:tcW w:type="dxa" w:w="7100"/>
+            <w:tcMar>
+              <w:top w:type="dxa" w:w="60"/>
+              <w:left w:type="dxa" w:w="80"/>
+              <w:bottom w:type="dxa" w:w="60"/>
+              <w:right w:type="dxa" w:w="80"/>
+            </w:tcMar>
+          </w:tcPr>
+          <w:p>
+            <w:r>
+              <w:rPr>
+                <w:rFonts w:ascii="Calibri" w:cs="Calibri" w:eastAsia="Calibri" w:hAnsi="Calibri"/>
+                <w:b w:val="false"/>
+                <w:bCs w:val="false"/>
+                <w:color w:val="000000"/>
+                <w:sz w:val="17"/>
+                <w:szCs w:val="17"/>
+              </w:rPr>
+              <w:t xml:space="preserve">SOURCE UNIQUE + COUVERTURE SÉCURITÉ (commit bc66b47) : migration SafetyLimits TERMINÉE (8 seuils — Phase3Activity + CommandeWatchdog ; plus aucun littéral local) ; garde anti-réintroduction (SafetyLimitsSourceGuardTest, 5 cas, scan du code source) ; CONFIG_ID (empreinte SHA-256 des 17 seuils) journalisé à chaque armement ; nouvelle tâche jacocoSecurityReport (soccer+control). Suite : 73 classes / 717 tests / 0 échec / ≈ 15,5 s. JaCoCo MESURÉ sur ce commit : soccer 86,7 % instructions / 72,4 % branches / 88,0 % lignes / 84,5 % méthodes ; périmètre sécurité complet 40,7 % / 36,2 % (control seul 31,3 % / 28,8 % — extension exigée avant dépôt, une partie de control étant hors chemin soccer). Corrections v53-D01→D08 : index des preuves 73=73 expliqué ; HAZ-39 aligné sur la valeur maîtresse CONF-BUFFER-001 ; résumé SafetyLimits requalifié (source unique acquise) ; A1/A2 transformées en exigences ouvertes REQ-FS-001/REQ-HF-001 ; historique du corps réduit aux étapes MAJEURES (43/49/51/53/54 — tout le reste au fichier séparé). BLOCAGES RESTANTS : E-03 au banc, confinement démontré.</w:t>
             </w:r>
           </w:p>
         </w:tc>

</xml_diff>